<commit_message>
Corrige o ponto 5.4 do contributo: a proibição da venda ambulante existe
O texto afirmava que a venda de animais em feiras e no comércio não
sedentário ficava sem requisitos de bem-estar. Está errado: o n.º 6 do
artigo 35.º do DL 276/2001 proíbe a venda ambulante de animais de
companhia e o mesmo artigo fixa as condições da venda em feiras e
mercados, com mera comunicação prévia à câmara para vistoria pelo
médico veterinário municipal. Como o DL 276/2001 não é revogado, não há
lacuna, há falta de articulação. Proposta e quadro-resumo ajustados.

Co-Authored-By: Claude Opus 5 <noreply@anthropic.com>
Claude-Session: https://claude.ai/code/session_01ETNym69SS49ymutsXowEHk
</commit_message>
<xml_diff>
--- a/DL 405_2026/Contributo_BEA_DL405_XXV_2026.docx
+++ b/DL 405_2026/Contributo_BEA_DL405_XXV_2026.docx
@@ -1899,7 +1899,20 @@
           <w:i w:val="0"/>
           <w:sz w:val="21"/>
         </w:rPr>
-        <w:t>O n.º 2 do art.º 133.º do Anexo proíbe a venda a retalho não sedentária de produtos fitofarmacêuticos, medicamentos, aditivos para alimentos para animais, armas e munições, combustíveis, moedas e notas e veículos; não proíbe a venda de animais vivos. Acresce que o n.º 2 do art.º 2.º do Decreto-Lei n.º 276/2001 exclui do conceito de «alojamento» os locais de venda em feiras ou mercados, pelo que a venda de animais nesses locais não está sujeita aos requisitos de alojamento. O resultado conjugado é um regime mais permissivo para a modalidade de venda que oferece menores garantias de bem-estar e de rastreabilidade.</w:t>
+        <w:t>O n.º 2 do art.º 133.º do Anexo proíbe a venda a retalho não sedentária de produtos fitofarmacêuticos, medicamentos, aditivos para alimentos para animais, armas e munições, combustíveis, moedas e notas e veículos; não proíbe a venda de animais vivos. A proibição existe, porém, na legislação vigente, e mantém-se: o n.º 6 do art.º 35.º do Decreto-Lei n.º 276/2001 dispõe que «não é permitida a venda ambulante de animais de companhia», e o seu art.º 35.º fixa as condições da venda em feiras e mercados, fazendo-a depender, na al. b) do n.º 3, de mera comunicação prévia à câmara para vistoria aos locais de venda pelo médico veterinário municipal. Como o Decreto-Lei n.º 276/2001 não é revogado, não há lacuna.</w:t>
+      </w:r>
+    </w:p>
+    <w:p>
+      <w:pPr>
+        <w:spacing w:after="120"/>
+      </w:pPr>
+      <w:r>
+        <w:rPr>
+          <w:b w:val="0"/>
+          <w:i w:val="0"/>
+          <w:sz w:val="21"/>
+        </w:rPr>
+        <w:t>O que há é falta de articulação. O regime das feiras e do comércio não sedentário do Anexo (art.ºs 131.º a 139.º) não remete para aquelas normas, e o elenco de proibições do art.º 133.º, lido isoladamente, sugere o contrário do que a lei determina. Note-se ainda que o n.º 2 do art.º 2.º do Decreto-Lei n.º 276/2001 exclui do conceito de «alojamento» os locais de venda em feiras ou mercados, pelo que o que a estes se aplica são as condições próprias dos seus art.ºs 34.º e 35.º, e não o regime dos alojamentos.</w:t>
       </w:r>
     </w:p>
     <w:p>
@@ -1938,7 +1951,7 @@
         <w:rPr>
           <w:sz w:val="21"/>
         </w:rPr>
-        <w:t>Aditar ao n.º 2 do art.º 133.º a proibição da venda a retalho não sedentária de animais de companhia, possibilidade que o art.º 30.º do Regulamento expressamente comporta, ou sujeitá-la a autorização prévia da DGAV.</w:t>
+        <w:t>Aditar ao n.º 2 do art.º 133.º a proibição da venda a retalho não sedentária de animais de companhia, por remissão para o n.º 6 do art.º 35.º do Decreto-Lei n.º 276/2001, de modo a que o elenco de proibições não induza em erro, e remeter o regime das feiras para as condições do art.º 35.º do mesmo diploma.</w:t>
       </w:r>
     </w:p>
     <w:p>
@@ -3105,7 +3118,7 @@
               <w:rPr>
                 <w:sz w:val="18"/>
               </w:rPr>
-              <w:t>Venda de animais vivos em comércio não sedentário e em leilão sem requisitos de bem-estar ou rastreabilidade.</w:t>
+              <w:t>O elenco de proibições do art.º 133.º omite os animais vivos, quando o n.º 6 do art.º 35.º do DL 276/2001 proíbe a venda ambulante de animais de companhia; e a atividade leiloeira abrange a venda de animais sem requisitos de identificação ou registo.</w:t>
             </w:r>
           </w:p>
         </w:tc>
@@ -3123,7 +3136,7 @@
               <w:rPr>
                 <w:sz w:val="18"/>
               </w:rPr>
-              <w:t>Proibir a venda não sedentária de animais de companhia ou sujeitá-la a autorização da DGAV; excluir os animais vivos da atividade leiloeira ou subordiná-la ao art.º 21.º do Regulamento.</w:t>
+              <w:t>Remeter para o n.º 6 do art.º 35.º e para as condições do art.º 35.º do DL 276/2001; excluir os animais vivos da atividade leiloeira ou subordiná-la ao art.º 21.º do Regulamento.</w:t>
             </w:r>
           </w:p>
         </w:tc>

</xml_diff>